<commit_message>
NAT: RA7 oficial unificado entre índice y cierre (texto y CE alineados)
</commit_message>
<xml_diff>
--- a/docx/09-nat-pat/09-nat-pat.docx
+++ b/docx/09-nat-pat/09-nat-pat.docx
@@ -784,7 +784,7 @@
           <w:b/>
           <w:bCs/>
         </w:rPr>
-        <w:t xml:space="preserve">RA7: Configura y administra el acceso de las redes locales a servicios exteriores.</w:t>
+        <w:t xml:space="preserve">RA7: Conecta redes privadas a redes públicas identificando y aplicando diferentes tecnologías.</w:t>
       </w:r>
     </w:p>
     <w:tbl>
@@ -856,18 +856,18 @@
               <w:pStyle w:val="Compact"/>
             </w:pPr>
             <w:r>
-              <w:t xml:space="preserve">Salida de redes privadas a públicas</w:t>
-            </w:r>
-          </w:p>
-        </w:tc>
-        <w:tc>
-          <w:tcPr/>
-          <w:p>
-            <w:pPr>
-              <w:pStyle w:val="Compact"/>
-            </w:pPr>
-            <w:r>
-              <w:t xml:space="preserve">✅ Puntos 1-4 + ⚡ Laboratorio (punto 9)</w:t>
+              <w:t xml:space="preserve">Ventajas e inconvenientes de NAT</w:t>
+            </w:r>
+          </w:p>
+        </w:tc>
+        <w:tc>
+          <w:tcPr/>
+          <w:p>
+            <w:pPr>
+              <w:pStyle w:val="Compact"/>
+            </w:pPr>
+            <w:r>
+              <w:t xml:space="preserve">✅ Teoría (puntos 1-2) + 🔥 Fireside Chat (punto 9)</w:t>
             </w:r>
           </w:p>
         </w:tc>
@@ -891,18 +891,18 @@
               <w:pStyle w:val="Compact"/>
             </w:pPr>
             <w:r>
-              <w:t xml:space="preserve">NAT/PAT en el router</w:t>
-            </w:r>
-          </w:p>
-        </w:tc>
-        <w:tc>
-          <w:tcPr/>
-          <w:p>
-            <w:pPr>
-              <w:pStyle w:val="Compact"/>
-            </w:pPr>
-            <w:r>
-              <w:t xml:space="preserve">✅ Puntos 3-4 y 8 + ⚡ Laboratorio (punto 9)</w:t>
+              <w:t xml:space="preserve">NAT estático</w:t>
+            </w:r>
+          </w:p>
+        </w:tc>
+        <w:tc>
+          <w:tcPr/>
+          <w:p>
+            <w:pPr>
+              <w:pStyle w:val="Compact"/>
+            </w:pPr>
+            <w:r>
+              <w:t xml:space="preserve">✅ Punto 3 + ⚡ Laboratorio (punto 9)</w:t>
             </w:r>
           </w:p>
         </w:tc>
@@ -926,18 +926,18 @@
               <w:pStyle w:val="Compact"/>
             </w:pPr>
             <w:r>
-              <w:t xml:space="preserve">Publicación de servicios internos</w:t>
-            </w:r>
-          </w:p>
-        </w:tc>
-        <w:tc>
-          <w:tcPr/>
-          <w:p>
-            <w:pPr>
-              <w:pStyle w:val="Compact"/>
-            </w:pPr>
-            <w:r>
-              <w:t xml:space="preserve">✅ Punto 5 + 🧠 Atrévete a pensar (punto 9)</w:t>
+              <w:t xml:space="preserve">NAT dinámico/PAT</w:t>
+            </w:r>
+          </w:p>
+        </w:tc>
+        <w:tc>
+          <w:tcPr/>
+          <w:p>
+            <w:pPr>
+              <w:pStyle w:val="Compact"/>
+            </w:pPr>
+            <w:r>
+              <w:t xml:space="preserve">✅ Puntos 3-4 + ⚡ Laboratorio (punto 9)</w:t>
             </w:r>
           </w:p>
         </w:tc>
@@ -961,18 +961,53 @@
               <w:pStyle w:val="Compact"/>
             </w:pPr>
             <w:r>
-              <w:t xml:space="preserve">Verificación y diagnóstico</w:t>
-            </w:r>
-          </w:p>
-        </w:tc>
-        <w:tc>
-          <w:tcPr/>
-          <w:p>
-            <w:pPr>
-              <w:pStyle w:val="Compact"/>
-            </w:pPr>
-            <w:r>
-              <w:t xml:space="preserve">✅ Puntos 6-7 + 💬 Entrevista (punto 9)</w:t>
+              <w:t xml:space="preserve">Port forwarding</w:t>
+            </w:r>
+          </w:p>
+        </w:tc>
+        <w:tc>
+          <w:tcPr/>
+          <w:p>
+            <w:pPr>
+              <w:pStyle w:val="Compact"/>
+            </w:pPr>
+            <w:r>
+              <w:t xml:space="preserve">✅ Punto 5 + ⚡ Laboratorio (punto 9, NAT destino)</w:t>
+            </w:r>
+          </w:p>
+        </w:tc>
+      </w:tr>
+      <w:tr>
+        <w:tc>
+          <w:tcPr/>
+          <w:p>
+            <w:pPr>
+              <w:pStyle w:val="Compact"/>
+            </w:pPr>
+            <w:r>
+              <w:t xml:space="preserve">e)</w:t>
+            </w:r>
+          </w:p>
+        </w:tc>
+        <w:tc>
+          <w:tcPr/>
+          <w:p>
+            <w:pPr>
+              <w:pStyle w:val="Compact"/>
+            </w:pPr>
+            <w:r>
+              <w:t xml:space="preserve">WiFi vs WiMax</w:t>
+            </w:r>
+          </w:p>
+        </w:tc>
+        <w:tc>
+          <w:tcPr/>
+          <w:p>
+            <w:pPr>
+              <w:pStyle w:val="Compact"/>
+            </w:pPr>
+            <w:r>
+              <w:t xml:space="preserve">✅ Punto 7 (estándares 802.11)</w:t>
             </w:r>
           </w:p>
         </w:tc>
@@ -17341,7 +17376,7 @@
           <w:b/>
           <w:bCs/>
         </w:rPr>
-        <w:t xml:space="preserve">RA7: Conecta redes privadas a redes públicas.</w:t>
+        <w:t xml:space="preserve">RA7: Conecta redes privadas a redes públicas identificando y aplicando diferentes tecnologías.</w:t>
       </w:r>
     </w:p>
     <w:tbl>
@@ -17424,7 +17459,7 @@
               <w:pStyle w:val="Compact"/>
             </w:pPr>
             <w:r>
-              <w:t xml:space="preserve">✅ Teoría (puntos 1-2) + 🔥 Fireside Chat</w:t>
+              <w:t xml:space="preserve">✅ Teoría (puntos 1-2) + 🔥 Fireside Chat (punto 9)</w:t>
             </w:r>
           </w:p>
         </w:tc>
@@ -17459,7 +17494,7 @@
               <w:pStyle w:val="Compact"/>
             </w:pPr>
             <w:r>
-              <w:t xml:space="preserve">✅ Punto 3 + ⚡ Laboratorio</w:t>
+              <w:t xml:space="preserve">✅ Punto 3 + ⚡ Laboratorio (punto 9)</w:t>
             </w:r>
           </w:p>
         </w:tc>
@@ -17494,7 +17529,7 @@
               <w:pStyle w:val="Compact"/>
             </w:pPr>
             <w:r>
-              <w:t xml:space="preserve">✅ Puntos 3-4 + ⚡ Laboratorio</w:t>
+              <w:t xml:space="preserve">✅ Puntos 3-4 + ⚡ Laboratorio (punto 9)</w:t>
             </w:r>
           </w:p>
         </w:tc>
@@ -17529,7 +17564,7 @@
               <w:pStyle w:val="Compact"/>
             </w:pPr>
             <w:r>
-              <w:t xml:space="preserve">✅ Punto 5 + ⚡ Laboratorio (NAT destino)</w:t>
+              <w:t xml:space="preserve">✅ Punto 5 + ⚡ Laboratorio (punto 9, NAT destino)</w:t>
             </w:r>
           </w:p>
         </w:tc>

</xml_diff>

<commit_message>
Revisión U09: pools/tablas NAT, numeración del cierre, crucigrama e informe
</commit_message>
<xml_diff>
--- a/docx/09-nat-pat/09-nat-pat.docx
+++ b/docx/09-nat-pat/09-nat-pat.docx
@@ -252,7 +252,7 @@
         </w:numPr>
       </w:pPr>
       <w:r>
-        <w:t xml:space="preserve">Diagnosticar problemas típicos: DNS roto tras NAT, aplicaciones que no funcionan, doble NAT.</w:t>
+        <w:t xml:space="preserve">Diagnosticar los problemas típicos de las aplicaciones detrás de NAT (FTP, VoIP, juegos, VPN) y sus soluciones.</w:t>
       </w:r>
     </w:p>
     <w:p>
@@ -494,7 +494,7 @@
                 <w:rPr>
                   <w:rStyle w:val="Hyperlink"/>
                 </w:rPr>
-                <w:t xml:space="preserve">05 · NAT de destino</w:t>
+                <w:t xml:space="preserve">05 · NAT destino (port forwarding)</w:t>
               </w:r>
             </w:hyperlink>
           </w:p>
@@ -666,7 +666,7 @@
               <w:pStyle w:val="Compact"/>
             </w:pPr>
             <w:r>
-              <w:t xml:space="preserve">Sé el Paquete, Fireside, Laboratorio, Crucigrama…</w:t>
+              <w:t xml:space="preserve">Sé el NAT, Fireside, Laboratorio, Crucigrama…</w:t>
             </w:r>
           </w:p>
         </w:tc>
@@ -1274,7 +1274,7 @@
         <w:pStyle w:val="BodyText"/>
       </w:pPr>
       <w:r>
-        <w:t xml:space="preserve">Si esto te suena de pasada, es porque ya lo rozaste en las unidades de IPv4. Aquí lo llevamos al fondo: por qué existe, qué resuelve y qué rompe.</w:t>
+        <w:t xml:space="preserve">Si esto te suena de pasada, es porque ya lo rozaste en la unidad de dirección IP. Aquí lo llevamos al fondo: por qué existe, qué resuelve y qué rompe.</w:t>
       </w:r>
     </w:p>
     <w:p>
@@ -4696,7 +4696,7 @@
         <w:t xml:space="preserve"> </w:t>
       </w:r>
       <w:r>
-        <w:t xml:space="preserve">de IPs públicas dentro de un /29 (ej. 83.45.12.80-83.45.12.85, 6 IPs utilizables). Cuando un equipo interno quiere salir, el router le asigna una de esas IPs mientras dure su conexión; cuando termina, la devuelve al pool.</w:t>
+        <w:t xml:space="preserve">de IPs públicas dentro de un /29 (ej. 83.45.12.81-83.45.12.86: las 6 IPs utilizables de la red 83.45.12.80/29). Cuando un equipo interno quiere salir, el router le asigna una de esas IPs mientras dure su conexión; cuando termina, la devuelve al pool.</w:t>
       </w:r>
     </w:p>
     <w:p>
@@ -4716,7 +4716,7 @@
         <w:rPr>
           <w:rStyle w:val="VerbatimChar"/>
         </w:rPr>
-        <w:t xml:space="preserve">192.168.1.10  →   83.45.12.78</w:t>
+        <w:t xml:space="preserve">192.168.1.10  →   83.45.12.81</w:t>
       </w:r>
       <w:r>
         <w:br/>
@@ -4725,7 +4725,7 @@
         <w:rPr>
           <w:rStyle w:val="VerbatimChar"/>
         </w:rPr>
-        <w:t xml:space="preserve">192.168.1.20  →   83.45.12.79</w:t>
+        <w:t xml:space="preserve">192.168.1.20  →   83.45.12.82</w:t>
       </w:r>
       <w:r>
         <w:br/>
@@ -4734,7 +4734,7 @@
         <w:rPr>
           <w:rStyle w:val="VerbatimChar"/>
         </w:rPr>
-        <w:t xml:space="preserve">192.168.1.30  →   83.45.12.80   (el .81 queda libre hasta que haga falta)</w:t>
+        <w:t xml:space="preserve">192.168.1.30  →   83.45.12.83   (el .84 queda libre hasta que haga falta)</w:t>
       </w:r>
     </w:p>
     <w:p>
@@ -4812,7 +4812,7 @@
         <w:rPr>
           <w:rStyle w:val="CommentTok"/>
         </w:rPr>
-        <w:t xml:space="preserve"># ip nat pool PUBLICO 83.45.12.78 83.45.12.81 netmask 255.255.255.248</w:t>
+        <w:t xml:space="preserve"># ip nat pool PUBLICO 83.45.12.81 83.45.12.86 netmask 255.255.255.248</w:t>
       </w:r>
       <w:r>
         <w:br/>
@@ -9619,7 +9619,7 @@
         <w:rPr>
           <w:rStyle w:val="VerbatimChar"/>
         </w:rPr>
-        <w:t xml:space="preserve">udp   192.168.1.  8.8.8.8:53  8.8.8.8:53</w:t>
+        <w:t xml:space="preserve">udp 83.45.12.78:60001  192.168.1.10:54321  8.8.8.8:53         8.8.8.8:53</w:t>
       </w:r>
       <w:r>
         <w:br/>
@@ -9628,7 +9628,7 @@
         <w:rPr>
           <w:rStyle w:val="VerbatimChar"/>
         </w:rPr>
-        <w:t xml:space="preserve">udp   192.168.1.  8.8.8.8:53  8.8.8.8:53</w:t>
+        <w:t xml:space="preserve">udp 83.45.12.78:60002  192.168.1.20:54321  8.8.8.8:53         8.8.8.8:53</w:t>
       </w:r>
     </w:p>
     <w:p>
@@ -11675,7 +11675,7 @@
         <w:t xml:space="preserve"> </w:t>
       </w:r>
       <w:r>
-        <w:t xml:space="preserve">puede romperse con NAT por dos vías:</w:t>
+        <w:t xml:space="preserve">choca con NAT por dos motivos:</w:t>
       </w:r>
       <w:r>
         <w:t xml:space="preserve"> </w:t>
@@ -11691,7 +11691,7 @@
         <w:t xml:space="preserve"> </w:t>
       </w:r>
       <w:r>
-        <w:t xml:space="preserve">autentica la cabecera IP completa (cambiarla rompe la verificación), mientras que</w:t>
+        <w:t xml:space="preserve">autentica la cabecera IP completa (cambiarla en el camino invalida la verificación) y</w:t>
       </w:r>
       <w:r>
         <w:t xml:space="preserve"> </w:t>
@@ -11707,33 +11707,17 @@
         <w:t xml:space="preserve"> </w:t>
       </w:r>
       <w:r>
-        <w:t xml:space="preserve">no autentica la cabecera IP pero cifra los puertos, de modo que con PAT no hay forma de multiplexar. NAT-T lo resuelve encapsulando en UDP:4500.ridad</w:t>
-      </w:r>
-      <w:r>
-        <w:t xml:space="preserve"> </w:t>
-      </w:r>
-      <w:r>
-        <w:rPr>
-          <w:b/>
-          <w:bCs/>
-        </w:rPr>
-        <w:t xml:space="preserve">falla</w:t>
-      </w:r>
-      <w:r>
-        <w:t xml:space="preserve"> </w:t>
-      </w:r>
-      <w:r>
-        <w:t xml:space="preserve">y el paquete se descarta. Solución:</w:t>
-      </w:r>
-      <w:r>
-        <w:t xml:space="preserve"> </w:t>
-      </w:r>
-      <w:r>
-        <w:rPr>
-          <w:b/>
-          <w:bCs/>
-        </w:rPr>
-        <w:t xml:space="preserve">NAT-T (NAT Traversal)</w:t>
+        <w:t xml:space="preserve">cifra los puertos de transporte, así que con PAT no hay forma de reescribirlos para distinguir conexiones.</w:t>
+      </w:r>
+      <w:r>
+        <w:t xml:space="preserve"> </w:t>
+      </w:r>
+      <w:r>
+        <w:rPr>
+          <w:b/>
+          <w:bCs/>
+        </w:rPr>
+        <w:t xml:space="preserve">Solución: NAT-T (NAT Traversal)</w:t>
       </w:r>
       <w:r>
         <w:t xml:space="preserve"> </w:t>
@@ -12172,7 +12156,7 @@
               <w:pStyle w:val="Compact"/>
             </w:pPr>
             <w:r>
-              <w:t xml:space="preserve">2,4 GHz</w:t>
+              <w:t xml:space="preserve">2,4 y 5 GHz</w:t>
             </w:r>
           </w:p>
         </w:tc>
@@ -12668,7 +12652,7 @@
         <w:t xml:space="preserve"> </w:t>
       </w:r>
       <w:r>
-        <w:t xml:space="preserve">(802.16, kilómetros) son primas, no hermanas: de n/ac/ax/be a la familia 802.11 le va muy bien.</w:t>
+        <w:t xml:space="preserve">(802.16, kilómetros) son primas, no hermanas: WiFi va de la generación n a la be, y WiMax se quedó en su 802.16.</w:t>
       </w:r>
     </w:p>
     <w:bookmarkEnd w:id="96"/>
@@ -13259,7 +13243,7 @@
               <w:pStyle w:val="Compact"/>
             </w:pPr>
             <w:r>
-              <w:t xml:space="preserve">192.168.1.10, .20, .30</w:t>
+              <w:t xml:space="preserve">192.168.1.11, .12, .13</w:t>
             </w:r>
           </w:p>
         </w:tc>
@@ -13311,30 +13295,6 @@
         </w:tc>
       </w:tr>
     </w:tbl>
-    <w:p>
-      <w:pPr>
-        <w:pStyle w:val="BlockText"/>
-      </w:pPr>
-      <w:r>
-        <w:t xml:space="preserve">⚠️</w:t>
-      </w:r>
-      <w:r>
-        <w:t xml:space="preserve"> </w:t>
-      </w:r>
-      <w:r>
-        <w:rPr>
-          <w:b/>
-          <w:bCs/>
-        </w:rPr>
-        <w:t xml:space="preserve">Detalle que confunde:</w:t>
-      </w:r>
-      <w:r>
-        <w:t xml:space="preserve"> </w:t>
-      </w:r>
-      <w:r>
-        <w:t xml:space="preserve">PC1 y el servidor web comparten IP en este guion (192.168.1.10). En un montaje real serían equipos distintos; aquí los separamos en los pasos para que veas las dos caras de NAT por separado. Si quieres ser estricto, usa 192.168.1.10 para el servidor y .11-.13 para los PCs.</w:t>
-      </w:r>
-    </w:p>
     <w:p>
       <w:r>
         <w:pict>
@@ -14991,7 +14951,7 @@
         <w:pStyle w:val="Heading1"/>
       </w:pPr>
       <w:r>
-        <w:t xml:space="preserve">9 — Cierre: consolida lo aprendido</w:t>
+        <w:t xml:space="preserve">09 — Cierre: consolida lo aprendido</w:t>
       </w:r>
     </w:p>
     <w:p>
@@ -15039,7 +14999,7 @@
         <w:t xml:space="preserve"> </w:t>
       </w:r>
       <w:r>
-        <w:t xml:space="preserve">→ 9 · Cierre: consolida lo aprendido</w:t>
+        <w:t xml:space="preserve">→ 09 · Cierre: consolida lo aprendido</w:t>
       </w:r>
     </w:p>
     <w:p>
@@ -15459,7 +15419,7 @@
         </w:numPr>
       </w:pPr>
       <w:r>
-        <w:t xml:space="preserve">Soy el estándar WiFi más común hoy en día. 2,4 GHz, 5 GHz, hasta 1,3 Gbps.</w:t>
+        <w:t xml:space="preserve">Soy un estándar WiFi que trabaja solo en 5 GHz, con velocidades de hasta 1,3 Gbps.</w:t>
       </w:r>
     </w:p>
     <w:p>
@@ -16969,7 +16929,7 @@
         <w:rPr>
           <w:rStyle w:val="VerbatimChar"/>
         </w:rPr>
-        <w:t xml:space="preserve">2. Técnica de traducción 1 a 1 fija (3+8 letras, 2 palabras)</w:t>
+        <w:t xml:space="preserve">2. Traductor de IPs dentro del payload (3 letras)</w:t>
       </w:r>
       <w:r>
         <w:br/>
@@ -17013,7 +16973,7 @@
         <w:t xml:space="preserve"> </w:t>
       </w:r>
       <w:r>
-        <w:t xml:space="preserve">1. PAT, 4. 6E, 5. VPN, 8. SHOWIPNATTRANSLATIONS</w:t>
+        <w:t xml:space="preserve">1. PAT, 4. 6E, 5. VPN, 7. NATESTATICO, 8. SHOWIPNATTRANSLATIONS</w:t>
       </w:r>
       <w:r>
         <w:t xml:space="preserve"> </w:t>
@@ -17029,7 +16989,7 @@
         <w:t xml:space="preserve"> </w:t>
       </w:r>
       <w:r>
-        <w:t xml:space="preserve">2. NATESTATICO, 3. UPnP, 6. INSIDE</w:t>
+        <w:t xml:space="preserve">2. ALG, 3. UPnP, 6. INSIDE</w:t>
       </w:r>
     </w:p>
     <w:p>
@@ -17254,7 +17214,7 @@
         <w:pStyle w:val="FirstParagraph"/>
       </w:pPr>
       <w:r>
-        <w:t xml:space="preserve">Depende del router y del tiempo de expiración. Teóricamente, con 65535 puertos disponibles por IP pública, PAT puede manejar hasta ~65.000 conexiones simultáneas. En la práctica, los routers domésticos manejan unos pocos miles antes de saturarse.</w:t>
+        <w:t xml:space="preserve">Depende del router y del tiempo de expiración. Teóricamente, con 65.535 puertos disponibles por IP pública, PAT puede manejar hasta ~65.000 conexiones simultáneas. En la práctica, los routers domésticos manejan unos pocos miles antes de saturarse.</w:t>
       </w:r>
     </w:p>
     <w:p>
@@ -17654,7 +17614,7 @@
           <w:rPr>
             <w:rStyle w:val="Hyperlink"/>
           </w:rPr>
-          <w:t xml:space="preserve">8 · Configuración completa</w:t>
+          <w:t xml:space="preserve">08 · Configuración completa</w:t>
         </w:r>
       </w:hyperlink>
       <w:r>

</xml_diff>